<commit_message>
chore: gitignore .DS_Store, add matplotlib dep, rebuild voter summary doc
- Stop tracking .DS_Store and ignore it going forward
- Add matplotlib>=3.8 for the match-method chart in the voter summary
- Rebuild docs/voter_summary_descriptive_stats.docx

Co-Authored-By: Claude Opus 4.8 (1M context) <noreply@anthropic.com>
</commit_message>
<xml_diff>
--- a/docs/voter_summary_descriptive_stats.docx
+++ b/docs/voter_summary_descriptive_stats.docx
@@ -29,7 +29,7 @@
     </w:p>
     <w:p>
       <w:r>
-        <w:t>Scope: real, FIPS-coded counties only. Non-county MIT reporting units (CT/ME/RI overseas &amp; write-in precincts under placeholder FIPS 'NA', and MO Kansas City under the 7-digit '2938000') are excluded, since the analysis considers only PDAs linkable to FIPS-coded counties. Standard deviation is the sample standard deviation. dem_margin = (dem_votes - rep_votes) / total_votes (positive = Democratic lean).</w:t>
+        <w:t>Scope: real, FIPS-coded counties only. Non-county MIT reporting units (CT/ME/RI overseas &amp; write-in precincts under placeholder FIPS 'NA', and MO Kansas City under '2938000') are excluded. Standard deviation is the sample standard deviation. dem_margin = (dem_votes − rep_votes) / total_votes (positive = Democratic lean).</w:t>
       </w:r>
     </w:p>
     <w:p>
@@ -456,7 +456,7 @@
     </w:p>
     <w:p>
       <w:r>
-        <w:t>For each presidential year: dem_margin statistics across all FIPS-coded counties, plus the number of counties carried by each party. 'Dem counties' = dem_votes &gt; rep_votes; 'Rep counties' = rep_votes &gt; dem_votes (ties, if any, are noted separately). Counts are of counties, not voters, so they over-represent small rural counties relative to the popular vote. The average margin is likewise an unweighted per-county figure.</w:t>
+        <w:t>dem_margin statistics across all FIPS-coded counties each year, plus counties carried by each party (Dem = dem_votes &gt; rep_votes; Rep = rep_votes &gt; dem_votes). Counts are of counties, not voters, so they over-represent small rural counties; the average margin is likewise unweighted.</w:t>
       </w:r>
     </w:p>
     <w:tbl>
@@ -563,7 +563,7 @@
               <w:rPr>
                 <w:b/>
               </w:rPr>
-              <w:t>Avg margin</w:t>
+              <w:t>Average margin</w:t>
             </w:r>
           </w:p>
         </w:tc>
@@ -1158,16 +1158,353 @@
     </w:tbl>
     <w:p>
       <w:r>
-        <w:t>Exact dem/rep ties: 2000 (1), 2004 (1), 2008 (1), 2012 (1), 2016 (1) (not counted in either party column).</w:t>
+        <w:t>Exact dem/rep ties: 2000 (1), 2004 (1), 2008 (1), 2012 (1), 2016 (1) (excluded from both columns).</w:t>
       </w:r>
     </w:p>
+    <w:p>
+      <w:r>
+        <w:br w:type="page"/>
+      </w:r>
+    </w:p>
+    <w:p>
+      <w:pPr>
+        <w:pStyle w:val="Heading1"/>
+      </w:pPr>
+      <w:r>
+        <w:t>PDA County → FIPS Match Methods</w:t>
+      </w:r>
+    </w:p>
+    <w:p>
+      <w:r>
+        <w:t>How each of the 14,009 report-county rows was resolved to a county FIPS code, across the three matching passes (exact → fuzzy → LLM) and the intentional non-matches (tribal/reservation rows, counties absent from the MIT source, and a small residual). Bars use a log scale so the smaller categories remain visible.</w:t>
+      </w:r>
+    </w:p>
+    <w:p>
+      <w:r>
+        <w:drawing>
+          <wp:inline xmlns:a="http://schemas.openxmlformats.org/drawingml/2006/main" xmlns:pic="http://schemas.openxmlformats.org/drawingml/2006/picture">
+            <wp:extent cx="5760720" cy="2720340"/>
+            <wp:docPr id="1" name="Picture 1"/>
+            <wp:cNvGraphicFramePr>
+              <a:graphicFrameLocks noChangeAspect="1"/>
+            </wp:cNvGraphicFramePr>
+            <a:graphic>
+              <a:graphicData uri="http://schemas.openxmlformats.org/drawingml/2006/picture">
+                <pic:pic>
+                  <pic:nvPicPr>
+                    <pic:cNvPr id="0" name="fips_match_methods.png"/>
+                    <pic:cNvPicPr/>
+                  </pic:nvPicPr>
+                  <pic:blipFill>
+                    <a:blip r:embed="rId9"/>
+                    <a:stretch>
+                      <a:fillRect/>
+                    </a:stretch>
+                  </pic:blipFill>
+                  <pic:spPr>
+                    <a:xfrm>
+                      <a:off x="0" y="0"/>
+                      <a:ext cx="5760720" cy="2720340"/>
+                    </a:xfrm>
+                    <a:prstGeom prst="rect"/>
+                  </pic:spPr>
+                </pic:pic>
+              </a:graphicData>
+            </a:graphic>
+          </wp:inline>
+        </w:drawing>
+      </w:r>
+    </w:p>
+    <w:tbl>
+      <w:tblPr>
+        <w:tblStyle w:val="LightGrid-Accent1"/>
+        <w:tblW w:type="auto" w:w="0"/>
+        <w:tblLook w:firstColumn="1" w:firstRow="1" w:lastColumn="0" w:lastRow="0" w:noHBand="0" w:noVBand="1" w:val="04A0"/>
+      </w:tblPr>
+      <w:tblGrid>
+        <w:gridCol w:w="2880"/>
+        <w:gridCol w:w="2880"/>
+        <w:gridCol w:w="2880"/>
+      </w:tblGrid>
+      <w:tr>
+        <w:tc>
+          <w:tcPr>
+            <w:tcW w:type="dxa" w:w="2880"/>
+          </w:tcPr>
+          <w:p>
+            <w:r>
+              <w:rPr>
+                <w:b/>
+              </w:rPr>
+              <w:t>Method</w:t>
+            </w:r>
+          </w:p>
+        </w:tc>
+        <w:tc>
+          <w:tcPr>
+            <w:tcW w:type="dxa" w:w="2880"/>
+          </w:tcPr>
+          <w:p>
+            <w:r>
+              <w:rPr>
+                <w:b/>
+              </w:rPr>
+              <w:t>Count</w:t>
+            </w:r>
+          </w:p>
+        </w:tc>
+        <w:tc>
+          <w:tcPr>
+            <w:tcW w:type="dxa" w:w="2880"/>
+          </w:tcPr>
+          <w:p>
+            <w:r>
+              <w:rPr>
+                <w:b/>
+              </w:rPr>
+              <w:t>Share</w:t>
+            </w:r>
+          </w:p>
+        </w:tc>
+      </w:tr>
+      <w:tr>
+        <w:tc>
+          <w:tcPr>
+            <w:tcW w:type="dxa" w:w="2880"/>
+          </w:tcPr>
+          <w:p>
+            <w:r>
+              <w:t>Exact (normalized name)</w:t>
+            </w:r>
+          </w:p>
+        </w:tc>
+        <w:tc>
+          <w:tcPr>
+            <w:tcW w:type="dxa" w:w="2880"/>
+          </w:tcPr>
+          <w:p>
+            <w:r>
+              <w:t>13,120</w:t>
+            </w:r>
+          </w:p>
+        </w:tc>
+        <w:tc>
+          <w:tcPr>
+            <w:tcW w:type="dxa" w:w="2880"/>
+          </w:tcPr>
+          <w:p>
+            <w:r>
+              <w:t>93.7%</w:t>
+            </w:r>
+          </w:p>
+        </w:tc>
+      </w:tr>
+      <w:tr>
+        <w:tc>
+          <w:tcPr>
+            <w:tcW w:type="dxa" w:w="2880"/>
+          </w:tcPr>
+          <w:p>
+            <w:r>
+              <w:t>No source county (terr. + AK)</w:t>
+            </w:r>
+          </w:p>
+        </w:tc>
+        <w:tc>
+          <w:tcPr>
+            <w:tcW w:type="dxa" w:w="2880"/>
+          </w:tcPr>
+          <w:p>
+            <w:r>
+              <w:t>380</w:t>
+            </w:r>
+          </w:p>
+        </w:tc>
+        <w:tc>
+          <w:tcPr>
+            <w:tcW w:type="dxa" w:w="2880"/>
+          </w:tcPr>
+          <w:p>
+            <w:r>
+              <w:t>2.7%</w:t>
+            </w:r>
+          </w:p>
+        </w:tc>
+      </w:tr>
+      <w:tr>
+        <w:tc>
+          <w:tcPr>
+            <w:tcW w:type="dxa" w:w="2880"/>
+          </w:tcPr>
+          <w:p>
+            <w:r>
+              <w:t>N/A — tribe/reservation</w:t>
+            </w:r>
+          </w:p>
+        </w:tc>
+        <w:tc>
+          <w:tcPr>
+            <w:tcW w:type="dxa" w:w="2880"/>
+          </w:tcPr>
+          <w:p>
+            <w:r>
+              <w:t>314</w:t>
+            </w:r>
+          </w:p>
+        </w:tc>
+        <w:tc>
+          <w:tcPr>
+            <w:tcW w:type="dxa" w:w="2880"/>
+          </w:tcPr>
+          <w:p>
+            <w:r>
+              <w:t>2.2%</w:t>
+            </w:r>
+          </w:p>
+        </w:tc>
+      </w:tr>
+      <w:tr>
+        <w:tc>
+          <w:tcPr>
+            <w:tcW w:type="dxa" w:w="2880"/>
+          </w:tcPr>
+          <w:p>
+            <w:r>
+              <w:t>Unmatched</w:t>
+            </w:r>
+          </w:p>
+        </w:tc>
+        <w:tc>
+          <w:tcPr>
+            <w:tcW w:type="dxa" w:w="2880"/>
+          </w:tcPr>
+          <w:p>
+            <w:r>
+              <w:t>88</w:t>
+            </w:r>
+          </w:p>
+        </w:tc>
+        <w:tc>
+          <w:tcPr>
+            <w:tcW w:type="dxa" w:w="2880"/>
+          </w:tcPr>
+          <w:p>
+            <w:r>
+              <w:t>0.6%</w:t>
+            </w:r>
+          </w:p>
+        </w:tc>
+      </w:tr>
+      <w:tr>
+        <w:tc>
+          <w:tcPr>
+            <w:tcW w:type="dxa" w:w="2880"/>
+          </w:tcPr>
+          <w:p>
+            <w:r>
+              <w:t>LLM (Opus 4.8, constrained)</w:t>
+            </w:r>
+          </w:p>
+        </w:tc>
+        <w:tc>
+          <w:tcPr>
+            <w:tcW w:type="dxa" w:w="2880"/>
+          </w:tcPr>
+          <w:p>
+            <w:r>
+              <w:t>62</w:t>
+            </w:r>
+          </w:p>
+        </w:tc>
+        <w:tc>
+          <w:tcPr>
+            <w:tcW w:type="dxa" w:w="2880"/>
+          </w:tcPr>
+          <w:p>
+            <w:r>
+              <w:t>0.4%</w:t>
+            </w:r>
+          </w:p>
+        </w:tc>
+      </w:tr>
+      <w:tr>
+        <w:tc>
+          <w:tcPr>
+            <w:tcW w:type="dxa" w:w="2880"/>
+          </w:tcPr>
+          <w:p>
+            <w:r>
+              <w:t>Fuzzy (difflib ≥0.90)</w:t>
+            </w:r>
+          </w:p>
+        </w:tc>
+        <w:tc>
+          <w:tcPr>
+            <w:tcW w:type="dxa" w:w="2880"/>
+          </w:tcPr>
+          <w:p>
+            <w:r>
+              <w:t>45</w:t>
+            </w:r>
+          </w:p>
+        </w:tc>
+        <w:tc>
+          <w:tcPr>
+            <w:tcW w:type="dxa" w:w="2880"/>
+          </w:tcPr>
+          <w:p>
+            <w:r>
+              <w:t>0.3%</w:t>
+            </w:r>
+          </w:p>
+        </w:tc>
+      </w:tr>
+      <w:tr>
+        <w:tc>
+          <w:tcPr>
+            <w:tcW w:type="dxa" w:w="2880"/>
+          </w:tcPr>
+          <w:p>
+            <w:r>
+              <w:rPr>
+                <w:b/>
+              </w:rPr>
+              <w:t>Total</w:t>
+            </w:r>
+          </w:p>
+        </w:tc>
+        <w:tc>
+          <w:tcPr>
+            <w:tcW w:type="dxa" w:w="2880"/>
+          </w:tcPr>
+          <w:p>
+            <w:r>
+              <w:rPr>
+                <w:b/>
+              </w:rPr>
+              <w:t>14,009</w:t>
+            </w:r>
+          </w:p>
+        </w:tc>
+        <w:tc>
+          <w:tcPr>
+            <w:tcW w:type="dxa" w:w="2880"/>
+          </w:tcPr>
+          <w:p>
+            <w:r>
+              <w:t>100.0%</w:t>
+            </w:r>
+          </w:p>
+        </w:tc>
+      </w:tr>
+    </w:tbl>
     <w:p/>
     <w:p>
       <w:r>
         <w:rPr>
           <w:i/>
         </w:rPr>
-        <w:t>Generated 2026-06-09 from branch feat/mit-voter-fips, after excluding non-county reporting units.</w:t>
+        <w:t>Generated 2026-06-09 from branch feat/mit-voter-fips.</w:t>
       </w:r>
     </w:p>
     <w:sectPr>

</xml_diff>